<commit_message>
docs(laporan): update dokumen laporan SDLC Phase 1, Phase 2, dan Phase 3
</commit_message>
<xml_diff>
--- a/laporan/01_Phase_1_Requirements_Analysis/IC-Requirements-Analysis-11526_WORD.docx
+++ b/laporan/01_Phase_1_Requirements_Analysis/IC-Requirements-Analysis-11526_WORD.docx
@@ -632,10 +632,10 @@
           <w:szCs w:val="28"/>
         </w:rPr>
         <w:sectPr>
-          <w:headerReference w:type="default" r:id="rId11"/>
           <w:footerReference w:type="default" r:id="rId12"/>
-          <w:headerReference w:type="first" r:id="rId13"/>
           <w:footerReference w:type="first" r:id="rId14"/>
+          <w:headerReference w:type="default" r:id="rId17"/>
+          <w:headerReference w:type="first" r:id="rId18"/>
           <w:pgSz w:w="12240" w:h="15840"/>
           <w:pgMar w:top="768" w:right="720" w:bottom="360" w:left="1008" w:header="374" w:footer="720" w:gutter="0"/>
           <w:cols w:space="720"/>
@@ -7998,11 +7998,13 @@
     <w:pPr>
       <w:pStyle w:val="Header"/>
     </w:pPr>
+    <w:r/>
   </w:p>
   <w:p>
     <w:pPr>
       <w:pStyle w:val="Header"/>
     </w:pPr>
+    <w:r/>
   </w:p>
 </w:hdr>
 </file>
@@ -8018,6 +8020,28 @@
     <w:pPr>
       <w:pStyle w:val="Header"/>
     </w:pPr>
+  </w:p>
+</w:hdr>
+</file>
+
+<file path=word/header3.xml><?xml version="1.0" encoding="utf-8"?>
+<w:hdr xmlns:m="http://schemas.openxmlformats.org/officeDocument/2006/math" xmlns:mc="http://schemas.openxmlformats.org/markup-compatibility/2006" xmlns:mo="http://schemas.microsoft.com/office/mac/office/2008/main" xmlns:mv="urn:schemas-microsoft-com:mac:vml" xmlns:o="urn:schemas-microsoft-com:office:office" xmlns:r="http://schemas.openxmlformats.org/officeDocument/2006/relationships" xmlns:v="urn:schemas-microsoft-com:vml" xmlns:w10="urn:schemas-microsoft-com:office:word" xmlns:w14="http://schemas.microsoft.com/office/word/2010/wordml" xmlns:w="http://schemas.openxmlformats.org/wordprocessingml/2006/main" xmlns:wne="http://schemas.microsoft.com/office/word/2006/wordml" xmlns:wp14="http://schemas.microsoft.com/office/word/2010/wordprocessingDrawing" xmlns:wp="http://schemas.openxmlformats.org/drawingml/2006/wordprocessingDrawing" xmlns:wpc="http://schemas.microsoft.com/office/word/2010/wordprocessingCanvas" xmlns:wpg="http://schemas.microsoft.com/office/word/2010/wordprocessingGroup" xmlns:wpi="http://schemas.microsoft.com/office/word/2010/wordprocessingInk" xmlns:wps="http://schemas.microsoft.com/office/word/2010/wordprocessingShape" mc:Ignorable="w14 wp14">
+  <w:p>
+    <w:pPr>
+      <w:pStyle w:val="Header"/>
+    </w:pPr>
+    <w:r/>
+  </w:p>
+</w:hdr>
+</file>
+
+<file path=word/header4.xml><?xml version="1.0" encoding="utf-8"?>
+<w:hdr xmlns:m="http://schemas.openxmlformats.org/officeDocument/2006/math" xmlns:mc="http://schemas.openxmlformats.org/markup-compatibility/2006" xmlns:mo="http://schemas.microsoft.com/office/mac/office/2008/main" xmlns:mv="urn:schemas-microsoft-com:mac:vml" xmlns:o="urn:schemas-microsoft-com:office:office" xmlns:r="http://schemas.openxmlformats.org/officeDocument/2006/relationships" xmlns:v="urn:schemas-microsoft-com:vml" xmlns:w10="urn:schemas-microsoft-com:office:word" xmlns:w14="http://schemas.microsoft.com/office/word/2010/wordml" xmlns:w="http://schemas.openxmlformats.org/wordprocessingml/2006/main" xmlns:wne="http://schemas.microsoft.com/office/word/2006/wordml" xmlns:wp14="http://schemas.microsoft.com/office/word/2010/wordprocessingDrawing" xmlns:wp="http://schemas.openxmlformats.org/drawingml/2006/wordprocessingDrawing" xmlns:wpc="http://schemas.microsoft.com/office/word/2010/wordprocessingCanvas" xmlns:wpg="http://schemas.microsoft.com/office/word/2010/wordprocessingGroup" xmlns:wpi="http://schemas.microsoft.com/office/word/2010/wordprocessingInk" xmlns:wps="http://schemas.microsoft.com/office/word/2010/wordprocessingShape" mc:Ignorable="w14 wp14">
+  <w:p>
+    <w:pPr>
+      <w:pStyle w:val="Header"/>
+    </w:pPr>
+    <w:r/>
   </w:p>
 </w:hdr>
 </file>

</xml_diff>